<commit_message>
Update paper with author affiliation, student email, and native OpenXML hyperlinks
</commit_message>
<xml_diff>
--- a/paper/research_paper.docx
+++ b/paper/research_paper.docx
@@ -37,10 +37,21 @@
           <w:rFonts w:ascii="Times New Roman" w:hAnsi="Times New Roman"/>
           <w:sz w:val="19"/>
         </w:rPr>
-        <w:t>Department of Computer Science, VIT-AP University, Amaravati, Andhra Pradesh, India</w:t>
+        <w:t>School of Computer Science and Engineering, VIT-AP University, Amaravati, Andhra Pradesh, India</w:t>
         <w:br/>
-        <w:t>Email: aayush@vitap.com</w:t>
+        <w:t xml:space="preserve">Email: </w:t>
       </w:r>
+      <w:hyperlink r:id="rId9">
+        <w:r>
+          <w:rPr>
+            <w:rFonts w:ascii="Times New Roman" w:hAnsi="Times New Roman"/>
+            <w:color w:val="0000FF"/>
+            <w:u w:val="single"/>
+            <w:sz w:val="19"/>
+          </w:rPr>
+          <w:t>Aayush.24bcb7029@vitapstudent.ac.in</w:t>
+        </w:r>
+      </w:hyperlink>
     </w:p>
     <w:p>
       <w:pPr>
@@ -206,7 +217,25 @@
           <w:rFonts w:ascii="Times New Roman" w:hAnsi="Times New Roman"/>
           <w:sz w:val="19"/>
         </w:rPr>
-        <w:t>Novelty &amp; Contributions: Avoiding unverified claims of general hallucination detection, this study delivers four concrete contributions: (1) We document an empirical instance of Pathological Confidence Inversion in sub-4B models, wherein verbalized certainty negatively correlates with accuracy on abstract symbolic algebra (AUROC = 0.384); (2) We demonstrate via cross-disciplinary validation on 310 MMLU Biology instances that confidence inversion is domain-specific to symbolic deduction, restoring to normal alignment (AUROC = 0.548) in factual science; (3) We quantify the False Reassurance Rate of black-box self-checking, demonstrating that 42.6% of affirmative verification decisions on complex tasks are objectively incorrect; and (4) We evaluate out-of-domain transfer via Leave-One-Domain-Out (LODO) cross-validation under strict budget parity (B = 2 auxiliary queries), proving that universal decision thresholds induce severe coverage collapse or unselective acceptance. All evaluation code and audited datasets are publicly available at https://github.com/akgetscreative-wq/slm-trust-calibration.</w:t>
+        <w:t xml:space="preserve">Novelty &amp; Contributions: Avoiding unverified claims of general hallucination detection, this study delivers four concrete contributions: (1) We document an empirical instance of Pathological Confidence Inversion in sub-4B models, wherein verbalized certainty negatively correlates with accuracy on abstract symbolic algebra (AUROC = 0.384); (2) We demonstrate via cross-disciplinary validation on 310 MMLU Biology instances that confidence inversion is domain-specific to symbolic deduction, restoring to normal alignment (AUROC = 0.548) in factual science; (3) We quantify the False Reassurance Rate of black-box self-checking, demonstrating that 42.6% of affirmative verification decisions on complex tasks are objectively incorrect; and (4) We evaluate out-of-domain transfer via Leave-One-Domain-Out (LODO) cross-validation under strict budget parity (B = 2 auxiliary queries), proving that universal decision thresholds induce severe coverage collapse or unselective acceptance. All evaluation code and audited datasets are publicly available at </w:t>
+      </w:r>
+      <w:hyperlink r:id="rId10">
+        <w:r>
+          <w:rPr>
+            <w:rFonts w:ascii="Times New Roman" w:hAnsi="Times New Roman"/>
+            <w:color w:val="0000FF"/>
+            <w:u w:val="single"/>
+            <w:sz w:val="19"/>
+          </w:rPr>
+          <w:t>https://github.com/akgetscreative-wq/slm-trust-calibration</w:t>
+        </w:r>
+      </w:hyperlink>
+      <w:r>
+        <w:rPr>
+          <w:rFonts w:ascii="Times New Roman" w:hAnsi="Times New Roman"/>
+          <w:sz w:val="19"/>
+        </w:rPr>
+        <w:t>.</w:t>
       </w:r>
     </w:p>
     <w:p>
@@ -1322,7 +1351,7 @@
                     <pic:cNvPicPr/>
                   </pic:nvPicPr>
                   <pic:blipFill>
-                    <a:blip r:embed="rId9"/>
+                    <a:blip r:embed="rId11"/>
                     <a:stretch>
                       <a:fillRect/>
                     </a:stretch>
@@ -2458,7 +2487,7 @@
                     <pic:cNvPicPr/>
                   </pic:nvPicPr>
                   <pic:blipFill>
-                    <a:blip r:embed="rId10"/>
+                    <a:blip r:embed="rId12"/>
                     <a:stretch>
                       <a:fillRect/>
                     </a:stretch>
@@ -2577,7 +2606,7 @@
                     <pic:cNvPicPr/>
                   </pic:nvPicPr>
                   <pic:blipFill>
-                    <a:blip r:embed="rId11"/>
+                    <a:blip r:embed="rId13"/>
                     <a:stretch>
                       <a:fillRect/>
                     </a:stretch>
@@ -2667,7 +2696,7 @@
                     <pic:cNvPicPr/>
                   </pic:nvPicPr>
                   <pic:blipFill>
-                    <a:blip r:embed="rId12"/>
+                    <a:blip r:embed="rId14"/>
                     <a:stretch>
                       <a:fillRect/>
                     </a:stretch>
@@ -6669,7 +6698,7 @@
                     <pic:cNvPicPr/>
                   </pic:nvPicPr>
                   <pic:blipFill>
-                    <a:blip r:embed="rId13"/>
+                    <a:blip r:embed="rId15"/>
                     <a:stretch>
                       <a:fillRect/>
                     </a:stretch>
@@ -8395,7 +8424,25 @@
           <w:rFonts w:ascii="Times New Roman" w:hAnsi="Times New Roman"/>
           <w:sz w:val="19"/>
         </w:rPr>
-        <w:t>All code, audited datasets, prompt schemas, and result files are fully accessible at the open-source companion repository: https://github.com/akgetscreative-wq/slm-trust-calibration. Deterministic replication scripts (reproduce_analysis.py) reproduce all reported metrics, tables, and publication figures without requiring local GPU hardware or model weights, and an interactive evaluation utility (trust_evaluator.py) provides black-box risk scoring demonstration.</w:t>
+        <w:t xml:space="preserve">All code, audited datasets, prompt schemas, and result files are fully accessible at the open-source companion repository: </w:t>
+      </w:r>
+      <w:hyperlink r:id="rId10">
+        <w:r>
+          <w:rPr>
+            <w:rFonts w:ascii="Times New Roman" w:hAnsi="Times New Roman"/>
+            <w:color w:val="0000FF"/>
+            <w:u w:val="single"/>
+            <w:sz w:val="19"/>
+          </w:rPr>
+          <w:t>https://github.com/akgetscreative-wq/slm-trust-calibration</w:t>
+        </w:r>
+      </w:hyperlink>
+      <w:r>
+        <w:rPr>
+          <w:rFonts w:ascii="Times New Roman" w:hAnsi="Times New Roman"/>
+          <w:sz w:val="19"/>
+        </w:rPr>
+        <w:t>. Deterministic replication scripts (reproduce_analysis.py) reproduce all reported metrics, tables, and publication figures without requiring local GPU hardware or model weights, and an interactive evaluation utility (trust_evaluator.py) provides black-box risk scoring demonstration.</w:t>
       </w:r>
     </w:p>
     <w:p>

</xml_diff>